<commit_message>
fix(server-kelas): pesan jelas kalau repo di folder sistem Windows; hapus link folder materi dari SINKRON_MATERI.gs
- server_kelas.py: cek di awal main(), repo di %SystemRoot% atau dist/ tidak bisa ditulis -> pesan
  "pindahkan ke Documents" alih-alih PermissionError traceback
- panduan: buka PowerShell biasa (bukan administrator), clone di Documents, baris troubleshooting
- SINKRON_MATERI.gs: kembalikan placeholder, link folder materi tidak boleh ada di repo publik

Co-Authored-By: Claude Opus 5.5 <noreply@anthropic.com>
</commit_message>
<xml_diff>
--- a/docs/PANDUAN_SERVER_KELAS.docx
+++ b/docs/PANDUAN_SERVER_KELAS.docx
@@ -333,57 +333,27 @@
         <w:spacing w:after="120"/>
       </w:pPr>
       <w:r>
-        <w:t xml:space="preserve">Pilih salah satu:</w:t>
-      </w:r>
-    </w:p>
-    <w:p>
-      <w:pPr>
-        <w:pStyle w:val="ListParagraph"/>
-        <w:numPr>
-          <w:ilvl w:val="0"/>
-          <w:numId w:val="2"/>
-        </w:numPr>
-        <w:spacing w:after="60"/>
-      </w:pPr>
-      <w:r>
-        <w:rPr>
-          <w:b/>
-          <w:bCs/>
-        </w:rPr>
-        <w:t xml:space="preserve">Tanpa Git (paling mudah):</w:t>
-      </w:r>
-      <w:r>
-        <w:t xml:space="preserve"> buka https://github.com/inspiralabs/ekskul-coding → tombol hijau </w:t>
-      </w:r>
-      <w:r>
-        <w:rPr>
-          <w:b/>
-          <w:bCs/>
-        </w:rPr>
-        <w:t xml:space="preserve">Code</w:t>
-      </w:r>
-      <w:r>
-        <w:t xml:space="preserve"> → </w:t>
-      </w:r>
-      <w:r>
-        <w:rPr>
-          <w:b/>
-          <w:bCs/>
-        </w:rPr>
-        <w:t xml:space="preserve">Download ZIP</w:t>
-      </w:r>
-      <w:r>
-        <w:t xml:space="preserve"> → klik kanan zip → </w:t>
-      </w:r>
-      <w:r>
-        <w:rPr>
-          <w:b/>
-          <w:bCs/>
-        </w:rPr>
-        <w:t xml:space="preserve">Extract All</w:t>
-      </w:r>
-      <w:r>
-        <w:t xml:space="preserve">, misalnya ke </w:t>
+        <w:t xml:space="preserve">Simpan repo di folder </w:t>
+      </w:r>
+      <w:r>
+        <w:rPr>
+          <w:b/>
+          <w:bCs/>
+        </w:rPr>
+        <w:t xml:space="preserve">Documents</w:t>
+      </w:r>
+      <w:r>
+        <w:t xml:space="preserve">. </w:t>
+      </w:r>
+      <w:r>
+        <w:rPr>
+          <w:b/>
+          <w:bCs/>
+        </w:rPr>
+        <w:t xml:space="preserve">Jangan</w:t>
+      </w:r>
+      <w:r>
+        <w:t xml:space="preserve"> di </w:t>
       </w:r>
       <w:r>
         <w:rPr>
@@ -391,10 +361,38 @@
           <w:color w:val="5A1620"/>
           <w:shd w:fill="F1ECE4" w:val="clear"/>
         </w:rPr>
-        <w:t xml:space="preserve">Documents\ekskul-coding</w:t>
-      </w:r>
-      <w:r>
-        <w:t xml:space="preserve">.</w:t>
+        <w:t xml:space="preserve">C:\Windows\System32</w:t>
+      </w:r>
+      <w:r>
+        <w:t xml:space="preserve">: itu folder sistem yang tidak boleh ditulis, dan server tidak bisa menyimpan nilai post-test di sana. Folder itu jadi tempat awal kalau PowerShell dibuka dengan </w:t>
+      </w:r>
+      <w:r>
+        <w:rPr>
+          <w:i/>
+          <w:iCs/>
+        </w:rPr>
+        <w:t xml:space="preserve">Run as administrator</w:t>
+      </w:r>
+      <w:r>
+        <w:t xml:space="preserve">, jadi </w:t>
+      </w:r>
+      <w:r>
+        <w:rPr>
+          <w:b/>
+          <w:bCs/>
+        </w:rPr>
+        <w:t xml:space="preserve">buka PowerShell biasa</w:t>
+      </w:r>
+      <w:r>
+        <w:t xml:space="preserve"> (tidak perlu administrator).</w:t>
+      </w:r>
+    </w:p>
+    <w:p>
+      <w:pPr>
+        <w:spacing w:after="120"/>
+      </w:pPr>
+      <w:r>
+        <w:t xml:space="preserve">Pilih salah satu:</w:t>
       </w:r>
     </w:p>
     <w:p>
@@ -411,10 +409,40 @@
           <w:b/>
           <w:bCs/>
         </w:rPr>
-        <w:t xml:space="preserve">Dengan Git:</w:t>
-      </w:r>
-      <w:r>
-        <w:t xml:space="preserve"> </w:t>
+        <w:t xml:space="preserve">Tanpa Git (paling mudah):</w:t>
+      </w:r>
+      <w:r>
+        <w:t xml:space="preserve"> buka https://github.com/inspiralabs/ekskul-coding → tombol hijau </w:t>
+      </w:r>
+      <w:r>
+        <w:rPr>
+          <w:b/>
+          <w:bCs/>
+        </w:rPr>
+        <w:t xml:space="preserve">Code</w:t>
+      </w:r>
+      <w:r>
+        <w:t xml:space="preserve"> → </w:t>
+      </w:r>
+      <w:r>
+        <w:rPr>
+          <w:b/>
+          <w:bCs/>
+        </w:rPr>
+        <w:t xml:space="preserve">Download ZIP</w:t>
+      </w:r>
+      <w:r>
+        <w:t xml:space="preserve"> → klik kanan zip → </w:t>
+      </w:r>
+      <w:r>
+        <w:rPr>
+          <w:b/>
+          <w:bCs/>
+        </w:rPr>
+        <w:t xml:space="preserve">Extract All</w:t>
+      </w:r>
+      <w:r>
+        <w:t xml:space="preserve">, misalnya ke </w:t>
       </w:r>
       <w:r>
         <w:rPr>
@@ -422,8 +450,71 @@
           <w:color w:val="5A1620"/>
           <w:shd w:fill="F1ECE4" w:val="clear"/>
         </w:rPr>
-        <w:t xml:space="preserve">git clone https://github.com/inspiralabs/ekskul-coding.git</w:t>
-      </w:r>
+        <w:t xml:space="preserve">Documents\ekskul-coding</w:t>
+      </w:r>
+      <w:r>
+        <w:t xml:space="preserve">.</w:t>
+      </w:r>
+    </w:p>
+    <w:p>
+      <w:pPr>
+        <w:pStyle w:val="ListParagraph"/>
+        <w:numPr>
+          <w:ilvl w:val="0"/>
+          <w:numId w:val="2"/>
+        </w:numPr>
+        <w:spacing w:after="60"/>
+      </w:pPr>
+      <w:r>
+        <w:rPr>
+          <w:b/>
+          <w:bCs/>
+        </w:rPr>
+        <w:t xml:space="preserve">Dengan Git:</w:t>
+      </w:r>
+      <w:r>
+        <w:t xml:space="preserve"> buka PowerShell biasa, lalu:</w:t>
+      </w:r>
+    </w:p>
+    <w:p>
+      <w:pPr>
+        <w:pBdr>
+          <w:top w:val="single" w:color="D9CFC2" w:sz="4" w:space="4"/>
+        </w:pBdr>
+        <w:shd w:fill="F1ECE4" w:val="clear"/>
+        <w:spacing w:after="0" w:line="260"/>
+        <w:ind w:left="200" w:right="200"/>
+      </w:pPr>
+      <w:r>
+        <w:rPr>
+          <w:rFonts w:ascii="Consolas" w:cs="Consolas" w:eastAsia="Consolas" w:hAnsi="Consolas"/>
+          <w:color w:val="2B2320"/>
+          <w:sz w:val="18"/>
+          <w:szCs w:val="18"/>
+        </w:rPr>
+        <w:t xml:space="preserve">  cd $HOME\Documents</w:t>
+      </w:r>
+    </w:p>
+    <w:p>
+      <w:pPr>
+        <w:shd w:fill="F1ECE4" w:val="clear"/>
+        <w:spacing w:after="0" w:line="260"/>
+        <w:ind w:left="200" w:right="200"/>
+      </w:pPr>
+      <w:r>
+        <w:rPr>
+          <w:rFonts w:ascii="Consolas" w:cs="Consolas" w:eastAsia="Consolas" w:hAnsi="Consolas"/>
+          <w:color w:val="2B2320"/>
+          <w:sz w:val="18"/>
+          <w:szCs w:val="18"/>
+        </w:rPr>
+        <w:t xml:space="preserve">  git clone https://github.com/inspiralabs/ekskul-coding.git</w:t>
+      </w:r>
+    </w:p>
+    <w:p>
+      <w:pPr>
+        <w:spacing w:after="60"/>
+      </w:pPr>
     </w:p>
     <w:p>
       <w:pPr>
@@ -1721,9 +1812,9 @@
         <w:tblLayout w:type="fixed"/>
       </w:tblPr>
       <w:tblGrid>
-        <w:gridCol w:w="2439"/>
-        <w:gridCol w:w="2380"/>
-        <w:gridCol w:w="4819"/>
+        <w:gridCol w:w="3015"/>
+        <w:gridCol w:w="3099"/>
+        <w:gridCol w:w="3524"/>
       </w:tblGrid>
       <w:tr>
         <w:trPr>
@@ -1731,7 +1822,7 @@
         </w:trPr>
         <w:tc>
           <w:tcPr>
-            <w:tcW w:type="dxa" w:w="2439"/>
+            <w:tcW w:type="dxa" w:w="3015"/>
             <w:tcBorders>
               <w:top w:val="single" w:color="D9CFC2" w:sz="4"/>
               <w:left w:val="single" w:color="D9CFC2" w:sz="4"/>
@@ -1762,7 +1853,7 @@
         </w:tc>
         <w:tc>
           <w:tcPr>
-            <w:tcW w:type="dxa" w:w="2380"/>
+            <w:tcW w:type="dxa" w:w="3099"/>
             <w:tcBorders>
               <w:top w:val="single" w:color="D9CFC2" w:sz="4"/>
               <w:left w:val="single" w:color="D9CFC2" w:sz="4"/>
@@ -1793,7 +1884,7 @@
         </w:tc>
         <w:tc>
           <w:tcPr>
-            <w:tcW w:type="dxa" w:w="4819"/>
+            <w:tcW w:type="dxa" w:w="3524"/>
             <w:tcBorders>
               <w:top w:val="single" w:color="D9CFC2" w:sz="4"/>
               <w:left w:val="single" w:color="D9CFC2" w:sz="4"/>
@@ -1829,7 +1920,7 @@
         </w:trPr>
         <w:tc>
           <w:tcPr>
-            <w:tcW w:type="dxa" w:w="2439"/>
+            <w:tcW w:type="dxa" w:w="3015"/>
             <w:tcBorders>
               <w:top w:val="single" w:color="D9CFC2" w:sz="4"/>
               <w:left w:val="single" w:color="D9CFC2" w:sz="4"/>
@@ -1854,16 +1945,24 @@
                 <w:color w:val="5A1620"/>
                 <w:shd w:fill="F1ECE4" w:val="clear"/>
               </w:rPr>
-              <w:t xml:space="preserve">py</w:t>
-            </w:r>
-            <w:r>
-              <w:t xml:space="preserve"> tidak dikenal</w:t>
+              <w:t xml:space="preserve">Repo tersimpan di folder sistem Windows</w:t>
+            </w:r>
+            <w:r>
+              <w:t xml:space="preserve"> / </w:t>
+            </w:r>
+            <w:r>
+              <w:rPr>
+                <w:rFonts w:ascii="Consolas" w:cs="Consolas" w:eastAsia="Consolas" w:hAnsi="Consolas"/>
+                <w:color w:val="5A1620"/>
+                <w:shd w:fill="F1ECE4" w:val="clear"/>
+              </w:rPr>
+              <w:t xml:space="preserve">Access is denied ... System32</w:t>
             </w:r>
           </w:p>
         </w:tc>
         <w:tc>
           <w:tcPr>
-            <w:tcW w:type="dxa" w:w="2380"/>
+            <w:tcW w:type="dxa" w:w="3099"/>
             <w:tcBorders>
               <w:top w:val="single" w:color="D9CFC2" w:sz="4"/>
               <w:left w:val="single" w:color="D9CFC2" w:sz="4"/>
@@ -1883,13 +1982,24 @@
               <w:spacing w:after="0"/>
             </w:pPr>
             <w:r>
-              <w:t xml:space="preserve">Python belum terpasang / tidak masuk PATH</w:t>
+              <w:t xml:space="preserve">Repo ada di </w:t>
+            </w:r>
+            <w:r>
+              <w:rPr>
+                <w:rFonts w:ascii="Consolas" w:cs="Consolas" w:eastAsia="Consolas" w:hAnsi="Consolas"/>
+                <w:color w:val="5A1620"/>
+                <w:shd w:fill="F1ECE4" w:val="clear"/>
+              </w:rPr>
+              <w:t xml:space="preserve">C:\Windows\System32</w:t>
+            </w:r>
+            <w:r>
+              <w:t xml:space="preserve"> (PowerShell dibuka sebagai administrator)</w:t>
             </w:r>
           </w:p>
         </w:tc>
         <w:tc>
           <w:tcPr>
-            <w:tcW w:type="dxa" w:w="4819"/>
+            <w:tcW w:type="dxa" w:w="3524"/>
             <w:tcBorders>
               <w:top w:val="single" w:color="D9CFC2" w:sz="4"/>
               <w:left w:val="single" w:color="D9CFC2" w:sz="4"/>
@@ -1909,26 +2019,7 @@
               <w:spacing w:after="0"/>
             </w:pPr>
             <w:r>
-              <w:t xml:space="preserve">Pasang ulang Python, centang "Add python.exe to PATH". Coba </w:t>
-            </w:r>
-            <w:r>
-              <w:rPr>
-                <w:rFonts w:ascii="Consolas" w:cs="Consolas" w:eastAsia="Consolas" w:hAnsi="Consolas"/>
-                <w:color w:val="5A1620"/>
-                <w:shd w:fill="F1ECE4" w:val="clear"/>
-              </w:rPr>
-              <w:t xml:space="preserve">python</w:t>
-            </w:r>
-            <w:r>
-              <w:t xml:space="preserve"> sebagai ganti </w:t>
-            </w:r>
-            <w:r>
-              <w:rPr>
-                <w:rFonts w:ascii="Consolas" w:cs="Consolas" w:eastAsia="Consolas" w:hAnsi="Consolas"/>
-                <w:color w:val="5A1620"/>
-                <w:shd w:fill="F1ECE4" w:val="clear"/>
-              </w:rPr>
-              <w:t xml:space="preserve">py</w:t>
+              <w:t xml:space="preserve">Pindahkan repo ke Documents (bagian A langkah 2), buka PowerShell biasa</w:t>
             </w:r>
           </w:p>
         </w:tc>
@@ -1939,7 +2030,7 @@
         </w:trPr>
         <w:tc>
           <w:tcPr>
-            <w:tcW w:type="dxa" w:w="2439"/>
+            <w:tcW w:type="dxa" w:w="3015"/>
             <w:tcBorders>
               <w:top w:val="single" w:color="D9CFC2" w:sz="4"/>
               <w:left w:val="single" w:color="D9CFC2" w:sz="4"/>
@@ -1964,13 +2055,16 @@
                 <w:color w:val="5A1620"/>
                 <w:shd w:fill="F1ECE4" w:val="clear"/>
               </w:rPr>
-              <w:t xml:space="preserve">Port 8000 dipakai</w:t>
+              <w:t xml:space="preserve">py</w:t>
+            </w:r>
+            <w:r>
+              <w:t xml:space="preserve"> tidak dikenal</w:t>
             </w:r>
           </w:p>
         </w:tc>
         <w:tc>
           <w:tcPr>
-            <w:tcW w:type="dxa" w:w="2380"/>
+            <w:tcW w:type="dxa" w:w="3099"/>
             <w:tcBorders>
               <w:top w:val="single" w:color="D9CFC2" w:sz="4"/>
               <w:left w:val="single" w:color="D9CFC2" w:sz="4"/>
@@ -1990,13 +2084,13 @@
               <w:spacing w:after="0"/>
             </w:pPr>
             <w:r>
-              <w:t xml:space="preserve">Server lain masih jalan</w:t>
+              <w:t xml:space="preserve">Python belum terpasang / tidak masuk PATH</w:t>
             </w:r>
           </w:p>
         </w:tc>
         <w:tc>
           <w:tcPr>
-            <w:tcW w:type="dxa" w:w="4819"/>
+            <w:tcW w:type="dxa" w:w="3524"/>
             <w:tcBorders>
               <w:top w:val="single" w:color="D9CFC2" w:sz="4"/>
               <w:left w:val="single" w:color="D9CFC2" w:sz="4"/>
@@ -2016,7 +2110,7 @@
               <w:spacing w:after="0"/>
             </w:pPr>
             <w:r>
-              <w:t xml:space="preserve">Tutup terminal server lama, atau jalankan dengan </w:t>
+              <w:t xml:space="preserve">Pasang ulang Python, centang "Add python.exe to PATH". Coba </w:t>
             </w:r>
             <w:r>
               <w:rPr>
@@ -2024,7 +2118,18 @@
                 <w:color w:val="5A1620"/>
                 <w:shd w:fill="F1ECE4" w:val="clear"/>
               </w:rPr>
-              <w:t xml:space="preserve">--port 8080</w:t>
+              <w:t xml:space="preserve">python</w:t>
+            </w:r>
+            <w:r>
+              <w:t xml:space="preserve"> sebagai ganti </w:t>
+            </w:r>
+            <w:r>
+              <w:rPr>
+                <w:rFonts w:ascii="Consolas" w:cs="Consolas" w:eastAsia="Consolas" w:hAnsi="Consolas"/>
+                <w:color w:val="5A1620"/>
+                <w:shd w:fill="F1ECE4" w:val="clear"/>
+              </w:rPr>
+              <w:t xml:space="preserve">py</w:t>
             </w:r>
           </w:p>
         </w:tc>
@@ -2035,7 +2140,7 @@
         </w:trPr>
         <w:tc>
           <w:tcPr>
-            <w:tcW w:type="dxa" w:w="2439"/>
+            <w:tcW w:type="dxa" w:w="3015"/>
             <w:tcBorders>
               <w:top w:val="single" w:color="D9CFC2" w:sz="4"/>
               <w:left w:val="single" w:color="D9CFC2" w:sz="4"/>
@@ -2055,13 +2160,18 @@
               <w:spacing w:after="0"/>
             </w:pPr>
             <w:r>
-              <w:t xml:space="preserve">Halaman tidak terbuka dari HP/laptop siswa</w:t>
+              <w:rPr>
+                <w:rFonts w:ascii="Consolas" w:cs="Consolas" w:eastAsia="Consolas" w:hAnsi="Consolas"/>
+                <w:color w:val="5A1620"/>
+                <w:shd w:fill="F1ECE4" w:val="clear"/>
+              </w:rPr>
+              <w:t xml:space="preserve">Port 8000 dipakai</w:t>
             </w:r>
           </w:p>
         </w:tc>
         <w:tc>
           <w:tcPr>
-            <w:tcW w:type="dxa" w:w="2380"/>
+            <w:tcW w:type="dxa" w:w="3099"/>
             <w:tcBorders>
               <w:top w:val="single" w:color="D9CFC2" w:sz="4"/>
               <w:left w:val="single" w:color="D9CFC2" w:sz="4"/>
@@ -2081,23 +2191,13 @@
               <w:spacing w:after="0"/>
             </w:pPr>
             <w:r>
-              <w:t xml:space="preserve">Profil WiFi masih </w:t>
-            </w:r>
-            <w:r>
-              <w:rPr>
-                <w:i/>
-                <w:iCs/>
-              </w:rPr>
-              <w:t xml:space="preserve">Public</w:t>
-            </w:r>
-            <w:r>
-              <w:t xml:space="preserve"> / firewall</w:t>
+              <w:t xml:space="preserve">Server lain masih jalan</w:t>
             </w:r>
           </w:p>
         </w:tc>
         <w:tc>
           <w:tcPr>
-            <w:tcW w:type="dxa" w:w="4819"/>
+            <w:tcW w:type="dxa" w:w="3524"/>
             <w:tcBorders>
               <w:top w:val="single" w:color="D9CFC2" w:sz="4"/>
               <w:left w:val="single" w:color="D9CFC2" w:sz="4"/>
@@ -2117,17 +2217,15 @@
               <w:spacing w:after="0"/>
             </w:pPr>
             <w:r>
-              <w:t xml:space="preserve">Ubah ke </w:t>
+              <w:t xml:space="preserve">Tutup terminal server lama, atau jalankan dengan </w:t>
             </w:r>
             <w:r>
               <w:rPr>
-                <w:i/>
-                <w:iCs/>
+                <w:rFonts w:ascii="Consolas" w:cs="Consolas" w:eastAsia="Consolas" w:hAnsi="Consolas"/>
+                <w:color w:val="5A1620"/>
+                <w:shd w:fill="F1ECE4" w:val="clear"/>
               </w:rPr>
-              <w:t xml:space="preserve">Private</w:t>
-            </w:r>
-            <w:r>
-              <w:t xml:space="preserve"> (bagian B langkah 2), izinkan Python di Windows Firewall</w:t>
+              <w:t xml:space="preserve">--port 8080</w:t>
             </w:r>
           </w:p>
         </w:tc>
@@ -2138,7 +2236,7 @@
         </w:trPr>
         <w:tc>
           <w:tcPr>
-            <w:tcW w:type="dxa" w:w="2439"/>
+            <w:tcW w:type="dxa" w:w="3015"/>
             <w:tcBorders>
               <w:top w:val="single" w:color="D9CFC2" w:sz="4"/>
               <w:left w:val="single" w:color="D9CFC2" w:sz="4"/>
@@ -2158,13 +2256,13 @@
               <w:spacing w:after="0"/>
             </w:pPr>
             <w:r>
-              <w:t xml:space="preserve">Masih tidak terbuka</w:t>
+              <w:t xml:space="preserve">Halaman tidak terbuka dari HP/laptop siswa</w:t>
             </w:r>
           </w:p>
         </w:tc>
         <w:tc>
           <w:tcPr>
-            <w:tcW w:type="dxa" w:w="2380"/>
+            <w:tcW w:type="dxa" w:w="3099"/>
             <w:tcBorders>
               <w:top w:val="single" w:color="D9CFC2" w:sz="4"/>
               <w:left w:val="single" w:color="D9CFC2" w:sz="4"/>
@@ -2184,13 +2282,23 @@
               <w:spacing w:after="0"/>
             </w:pPr>
             <w:r>
-              <w:t xml:space="preserve">WiFi sekolah memblokir antar-perangkat</w:t>
+              <w:t xml:space="preserve">Profil WiFi masih </w:t>
+            </w:r>
+            <w:r>
+              <w:rPr>
+                <w:i/>
+                <w:iCs/>
+              </w:rPr>
+              <w:t xml:space="preserve">Public</w:t>
+            </w:r>
+            <w:r>
+              <w:t xml:space="preserve"> / firewall</w:t>
             </w:r>
           </w:p>
         </w:tc>
         <w:tc>
           <w:tcPr>
-            <w:tcW w:type="dxa" w:w="4819"/>
+            <w:tcW w:type="dxa" w:w="3524"/>
             <w:tcBorders>
               <w:top w:val="single" w:color="D9CFC2" w:sz="4"/>
               <w:left w:val="single" w:color="D9CFC2" w:sz="4"/>
@@ -2210,7 +2318,17 @@
               <w:spacing w:after="0"/>
             </w:pPr>
             <w:r>
-              <w:t xml:space="preserve">Pakai hotspot HP atau router sendiri; semua perangkat di jaringan itu</w:t>
+              <w:t xml:space="preserve">Ubah ke </w:t>
+            </w:r>
+            <w:r>
+              <w:rPr>
+                <w:i/>
+                <w:iCs/>
+              </w:rPr>
+              <w:t xml:space="preserve">Private</w:t>
+            </w:r>
+            <w:r>
+              <w:t xml:space="preserve"> (bagian B langkah 2), izinkan Python di Windows Firewall</w:t>
             </w:r>
           </w:p>
         </w:tc>
@@ -2221,7 +2339,7 @@
         </w:trPr>
         <w:tc>
           <w:tcPr>
-            <w:tcW w:type="dxa" w:w="2439"/>
+            <w:tcW w:type="dxa" w:w="3015"/>
             <w:tcBorders>
               <w:top w:val="single" w:color="D9CFC2" w:sz="4"/>
               <w:left w:val="single" w:color="D9CFC2" w:sz="4"/>
@@ -2241,13 +2359,13 @@
               <w:spacing w:after="0"/>
             </w:pPr>
             <w:r>
-              <w:t xml:space="preserve">Alamat di terminal lebih dari satu</w:t>
+              <w:t xml:space="preserve">Masih tidak terbuka</w:t>
             </w:r>
           </w:p>
         </w:tc>
         <w:tc>
           <w:tcPr>
-            <w:tcW w:type="dxa" w:w="2380"/>
+            <w:tcW w:type="dxa" w:w="3099"/>
             <w:tcBorders>
               <w:top w:val="single" w:color="D9CFC2" w:sz="4"/>
               <w:left w:val="single" w:color="D9CFC2" w:sz="4"/>
@@ -2267,13 +2385,13 @@
               <w:spacing w:after="0"/>
             </w:pPr>
             <w:r>
-              <w:t xml:space="preserve">Laptop punya beberapa adaptor jaringan</w:t>
+              <w:t xml:space="preserve">WiFi sekolah memblokir antar-perangkat</w:t>
             </w:r>
           </w:p>
         </w:tc>
         <w:tc>
           <w:tcPr>
-            <w:tcW w:type="dxa" w:w="4819"/>
+            <w:tcW w:type="dxa" w:w="3524"/>
             <w:tcBorders>
               <w:top w:val="single" w:color="D9CFC2" w:sz="4"/>
               <w:left w:val="single" w:color="D9CFC2" w:sz="4"/>
@@ -2293,18 +2411,7 @@
               <w:spacing w:after="0"/>
             </w:pPr>
             <w:r>
-              <w:t xml:space="preserve">Pakai yang bertanda </w:t>
-            </w:r>
-            <w:r>
-              <w:rPr>
-                <w:rFonts w:ascii="Consolas" w:cs="Consolas" w:eastAsia="Consolas" w:hAnsi="Consolas"/>
-                <w:color w:val="5A1620"/>
-                <w:shd w:fill="F1ECE4" w:val="clear"/>
-              </w:rPr>
-              <w:t xml:space="preserve">&lt;- utama (WiFi)</w:t>
-            </w:r>
-            <w:r>
-              <w:t xml:space="preserve">; kalau gagal, coba yang lain</w:t>
+              <w:t xml:space="preserve">Pakai hotspot HP atau router sendiri; semua perangkat di jaringan itu</w:t>
             </w:r>
           </w:p>
         </w:tc>
@@ -2315,7 +2422,7 @@
         </w:trPr>
         <w:tc>
           <w:tcPr>
-            <w:tcW w:type="dxa" w:w="2439"/>
+            <w:tcW w:type="dxa" w:w="3015"/>
             <w:tcBorders>
               <w:top w:val="single" w:color="D9CFC2" w:sz="4"/>
               <w:left w:val="single" w:color="D9CFC2" w:sz="4"/>
@@ -2335,24 +2442,13 @@
               <w:spacing w:after="0"/>
             </w:pPr>
             <w:r>
-              <w:t xml:space="preserve">Halaman pengajar </w:t>
-            </w:r>
-            <w:r>
-              <w:rPr>
-                <w:rFonts w:ascii="Consolas" w:cs="Consolas" w:eastAsia="Consolas" w:hAnsi="Consolas"/>
-                <w:color w:val="5A1620"/>
-                <w:shd w:fill="F1ECE4" w:val="clear"/>
-              </w:rPr>
-              <w:t xml:space="preserve">/guru</w:t>
-            </w:r>
-            <w:r>
-              <w:t xml:space="preserve"> "Khusus pengajar"</w:t>
+              <w:t xml:space="preserve">Alamat di terminal lebih dari satu</w:t>
             </w:r>
           </w:p>
         </w:tc>
         <w:tc>
           <w:tcPr>
-            <w:tcW w:type="dxa" w:w="2380"/>
+            <w:tcW w:type="dxa" w:w="3099"/>
             <w:tcBorders>
               <w:top w:val="single" w:color="D9CFC2" w:sz="4"/>
               <w:left w:val="single" w:color="D9CFC2" w:sz="4"/>
@@ -2372,13 +2468,13 @@
               <w:spacing w:after="0"/>
             </w:pPr>
             <w:r>
-              <w:t xml:space="preserve">Dibuka dari perangkat lain</w:t>
+              <w:t xml:space="preserve">Laptop punya beberapa adaptor jaringan</w:t>
             </w:r>
           </w:p>
         </w:tc>
         <w:tc>
           <w:tcPr>
-            <w:tcW w:type="dxa" w:w="4819"/>
+            <w:tcW w:type="dxa" w:w="3524"/>
             <w:tcBorders>
               <w:top w:val="single" w:color="D9CFC2" w:sz="4"/>
               <w:left w:val="single" w:color="D9CFC2" w:sz="4"/>
@@ -2398,7 +2494,7 @@
               <w:spacing w:after="0"/>
             </w:pPr>
             <w:r>
-              <w:t xml:space="preserve">Buka di laptop pengajar: </w:t>
+              <w:t xml:space="preserve">Pakai yang bertanda </w:t>
             </w:r>
             <w:r>
               <w:rPr>
@@ -2406,7 +2502,10 @@
                 <w:color w:val="5A1620"/>
                 <w:shd w:fill="F1ECE4" w:val="clear"/>
               </w:rPr>
-              <w:t xml:space="preserve">http://127.0.0.1:8000/guru</w:t>
+              <w:t xml:space="preserve">&lt;- utama (WiFi)</w:t>
+            </w:r>
+            <w:r>
+              <w:t xml:space="preserve">; kalau gagal, coba yang lain</w:t>
             </w:r>
           </w:p>
         </w:tc>
@@ -2417,7 +2516,7 @@
         </w:trPr>
         <w:tc>
           <w:tcPr>
-            <w:tcW w:type="dxa" w:w="2439"/>
+            <w:tcW w:type="dxa" w:w="3015"/>
             <w:tcBorders>
               <w:top w:val="single" w:color="D9CFC2" w:sz="4"/>
               <w:left w:val="single" w:color="D9CFC2" w:sz="4"/>
@@ -2437,13 +2536,24 @@
               <w:spacing w:after="0"/>
             </w:pPr>
             <w:r>
-              <w:t xml:space="preserve">Siswa melihat "Belum dibuka"</w:t>
+              <w:t xml:space="preserve">Halaman pengajar </w:t>
+            </w:r>
+            <w:r>
+              <w:rPr>
+                <w:rFonts w:ascii="Consolas" w:cs="Consolas" w:eastAsia="Consolas" w:hAnsi="Consolas"/>
+                <w:color w:val="5A1620"/>
+                <w:shd w:fill="F1ECE4" w:val="clear"/>
+              </w:rPr>
+              <w:t xml:space="preserve">/guru</w:t>
+            </w:r>
+            <w:r>
+              <w:t xml:space="preserve"> "Khusus pengajar"</w:t>
             </w:r>
           </w:p>
         </w:tc>
         <w:tc>
           <w:tcPr>
-            <w:tcW w:type="dxa" w:w="2380"/>
+            <w:tcW w:type="dxa" w:w="3099"/>
             <w:tcBorders>
               <w:top w:val="single" w:color="D9CFC2" w:sz="4"/>
               <w:left w:val="single" w:color="D9CFC2" w:sz="4"/>
@@ -2463,13 +2573,13 @@
               <w:spacing w:after="0"/>
             </w:pPr>
             <w:r>
-              <w:t xml:space="preserve">Post-test belum dibuka</w:t>
+              <w:t xml:space="preserve">Dibuka dari perangkat lain</w:t>
             </w:r>
           </w:p>
         </w:tc>
         <w:tc>
           <w:tcPr>
-            <w:tcW w:type="dxa" w:w="4819"/>
+            <w:tcW w:type="dxa" w:w="3524"/>
             <w:tcBorders>
               <w:top w:val="single" w:color="D9CFC2" w:sz="4"/>
               <w:left w:val="single" w:color="D9CFC2" w:sz="4"/>
@@ -2489,17 +2599,15 @@
               <w:spacing w:after="0"/>
             </w:pPr>
             <w:r>
-              <w:t xml:space="preserve">Halaman pengajar → </w:t>
+              <w:t xml:space="preserve">Buka di laptop pengajar: </w:t>
             </w:r>
             <w:r>
               <w:rPr>
-                <w:b/>
-                <w:bCs/>
+                <w:rFonts w:ascii="Consolas" w:cs="Consolas" w:eastAsia="Consolas" w:hAnsi="Consolas"/>
+                <w:color w:val="5A1620"/>
+                <w:shd w:fill="F1ECE4" w:val="clear"/>
               </w:rPr>
-              <w:t xml:space="preserve">Buka</w:t>
-            </w:r>
-            <w:r>
-              <w:t xml:space="preserve">, lalu siswa muat ulang halaman</w:t>
+              <w:t xml:space="preserve">http://127.0.0.1:8000/guru</w:t>
             </w:r>
           </w:p>
         </w:tc>
@@ -2510,7 +2618,7 @@
         </w:trPr>
         <w:tc>
           <w:tcPr>
-            <w:tcW w:type="dxa" w:w="2439"/>
+            <w:tcW w:type="dxa" w:w="3015"/>
             <w:tcBorders>
               <w:top w:val="single" w:color="D9CFC2" w:sz="4"/>
               <w:left w:val="single" w:color="D9CFC2" w:sz="4"/>
@@ -2530,21 +2638,13 @@
               <w:spacing w:after="0"/>
             </w:pPr>
             <w:r>
-              <w:rPr>
-                <w:rFonts w:ascii="Consolas" w:cs="Consolas" w:eastAsia="Consolas" w:hAnsi="Consolas"/>
-                <w:color w:val="5A1620"/>
-                <w:shd w:fill="F1ECE4" w:val="clear"/>
-              </w:rPr>
-              <w:t xml:space="preserve">smp-10.xlsx</w:t>
-            </w:r>
-            <w:r>
-              <w:t xml:space="preserve"> tidak bisa disimpan/diperbarui</w:t>
+              <w:t xml:space="preserve">Siswa melihat "Belum dibuka"</w:t>
             </w:r>
           </w:p>
         </w:tc>
         <w:tc>
           <w:tcPr>
-            <w:tcW w:type="dxa" w:w="2380"/>
+            <w:tcW w:type="dxa" w:w="3099"/>
             <w:tcBorders>
               <w:top w:val="single" w:color="D9CFC2" w:sz="4"/>
               <w:left w:val="single" w:color="D9CFC2" w:sz="4"/>
@@ -2564,13 +2664,13 @@
               <w:spacing w:after="0"/>
             </w:pPr>
             <w:r>
-              <w:t xml:space="preserve">File sedang dibuka di Excel</w:t>
+              <w:t xml:space="preserve">Post-test belum dibuka</w:t>
             </w:r>
           </w:p>
         </w:tc>
         <w:tc>
           <w:tcPr>
-            <w:tcW w:type="dxa" w:w="4819"/>
+            <w:tcW w:type="dxa" w:w="3524"/>
             <w:tcBorders>
               <w:top w:val="single" w:color="D9CFC2" w:sz="4"/>
               <w:left w:val="single" w:color="D9CFC2" w:sz="4"/>
@@ -2590,28 +2690,17 @@
               <w:spacing w:after="0"/>
             </w:pPr>
             <w:r>
-              <w:t xml:space="preserve">Jawaban tetap aman di </w:t>
-            </w:r>
-            <w:r>
-              <w:rPr>
-                <w:rFonts w:ascii="Consolas" w:cs="Consolas" w:eastAsia="Consolas" w:hAnsi="Consolas"/>
-                <w:color w:val="5A1620"/>
-                <w:shd w:fill="F1ECE4" w:val="clear"/>
-              </w:rPr>
-              <w:t xml:space="preserve">.jsonl</w:t>
-            </w:r>
-            <w:r>
-              <w:t xml:space="preserve">. Tutup Excel, lalu </w:t>
+              <w:t xml:space="preserve">Halaman pengajar → </w:t>
             </w:r>
             <w:r>
               <w:rPr>
                 <w:b/>
                 <w:bCs/>
               </w:rPr>
-              <w:t xml:space="preserve">Unduh .xlsx</w:t>
-            </w:r>
-            <w:r>
-              <w:t xml:space="preserve"> dari halaman pengajar</w:t>
+              <w:t xml:space="preserve">Buka</w:t>
+            </w:r>
+            <w:r>
+              <w:t xml:space="preserve">, lalu siswa muat ulang halaman</w:t>
             </w:r>
           </w:p>
         </w:tc>
@@ -2622,7 +2711,7 @@
         </w:trPr>
         <w:tc>
           <w:tcPr>
-            <w:tcW w:type="dxa" w:w="2439"/>
+            <w:tcW w:type="dxa" w:w="3015"/>
             <w:tcBorders>
               <w:top w:val="single" w:color="D9CFC2" w:sz="4"/>
               <w:left w:val="single" w:color="D9CFC2" w:sz="4"/>
@@ -2642,13 +2731,21 @@
               <w:spacing w:after="0"/>
             </w:pPr>
             <w:r>
-              <w:t xml:space="preserve">Server/WiFi bermasalah total</w:t>
+              <w:rPr>
+                <w:rFonts w:ascii="Consolas" w:cs="Consolas" w:eastAsia="Consolas" w:hAnsi="Consolas"/>
+                <w:color w:val="5A1620"/>
+                <w:shd w:fill="F1ECE4" w:val="clear"/>
+              </w:rPr>
+              <w:t xml:space="preserve">smp-10.xlsx</w:t>
+            </w:r>
+            <w:r>
+              <w:t xml:space="preserve"> tidak bisa disimpan/diperbarui</w:t>
             </w:r>
           </w:p>
         </w:tc>
         <w:tc>
           <w:tcPr>
-            <w:tcW w:type="dxa" w:w="2380"/>
+            <w:tcW w:type="dxa" w:w="3099"/>
             <w:tcBorders>
               <w:top w:val="single" w:color="D9CFC2" w:sz="4"/>
               <w:left w:val="single" w:color="D9CFC2" w:sz="4"/>
@@ -2667,11 +2764,14 @@
             <w:pPr>
               <w:spacing w:after="0"/>
             </w:pPr>
+            <w:r>
+              <w:t xml:space="preserve">File sedang dibuka di Excel</w:t>
+            </w:r>
           </w:p>
         </w:tc>
         <w:tc>
           <w:tcPr>
-            <w:tcW w:type="dxa" w:w="4819"/>
+            <w:tcW w:type="dxa" w:w="3524"/>
             <w:tcBorders>
               <w:top w:val="single" w:color="D9CFC2" w:sz="4"/>
               <w:left w:val="single" w:color="D9CFC2" w:sz="4"/>
@@ -2679,6 +2779,107 @@
               <w:right w:val="single" w:color="D9CFC2" w:sz="4"/>
             </w:tcBorders>
             <w:shd w:fill="FFFFFF" w:val="clear"/>
+            <w:tcMar>
+              <w:top w:type="dxa" w:w="60"/>
+              <w:left w:type="dxa" w:w="100"/>
+              <w:bottom w:type="dxa" w:w="60"/>
+              <w:right w:type="dxa" w:w="100"/>
+            </w:tcMar>
+          </w:tcPr>
+          <w:p>
+            <w:pPr>
+              <w:spacing w:after="0"/>
+            </w:pPr>
+            <w:r>
+              <w:t xml:space="preserve">Jawaban tetap aman di </w:t>
+            </w:r>
+            <w:r>
+              <w:rPr>
+                <w:rFonts w:ascii="Consolas" w:cs="Consolas" w:eastAsia="Consolas" w:hAnsi="Consolas"/>
+                <w:color w:val="5A1620"/>
+                <w:shd w:fill="F1ECE4" w:val="clear"/>
+              </w:rPr>
+              <w:t xml:space="preserve">.jsonl</w:t>
+            </w:r>
+            <w:r>
+              <w:t xml:space="preserve">. Tutup Excel, lalu </w:t>
+            </w:r>
+            <w:r>
+              <w:rPr>
+                <w:b/>
+                <w:bCs/>
+              </w:rPr>
+              <w:t xml:space="preserve">Unduh .xlsx</w:t>
+            </w:r>
+            <w:r>
+              <w:t xml:space="preserve"> dari halaman pengajar</w:t>
+            </w:r>
+          </w:p>
+        </w:tc>
+      </w:tr>
+      <w:tr>
+        <w:trPr>
+          <w:tblHeader w:val="off"/>
+        </w:trPr>
+        <w:tc>
+          <w:tcPr>
+            <w:tcW w:type="dxa" w:w="3015"/>
+            <w:tcBorders>
+              <w:top w:val="single" w:color="D9CFC2" w:sz="4"/>
+              <w:left w:val="single" w:color="D9CFC2" w:sz="4"/>
+              <w:bottom w:val="single" w:color="D9CFC2" w:sz="4"/>
+              <w:right w:val="single" w:color="D9CFC2" w:sz="4"/>
+            </w:tcBorders>
+            <w:shd w:fill="FAF8F5" w:val="clear"/>
+            <w:tcMar>
+              <w:top w:type="dxa" w:w="60"/>
+              <w:left w:type="dxa" w:w="100"/>
+              <w:bottom w:type="dxa" w:w="60"/>
+              <w:right w:type="dxa" w:w="100"/>
+            </w:tcMar>
+          </w:tcPr>
+          <w:p>
+            <w:pPr>
+              <w:spacing w:after="0"/>
+            </w:pPr>
+            <w:r>
+              <w:t xml:space="preserve">Server/WiFi bermasalah total</w:t>
+            </w:r>
+          </w:p>
+        </w:tc>
+        <w:tc>
+          <w:tcPr>
+            <w:tcW w:type="dxa" w:w="3099"/>
+            <w:tcBorders>
+              <w:top w:val="single" w:color="D9CFC2" w:sz="4"/>
+              <w:left w:val="single" w:color="D9CFC2" w:sz="4"/>
+              <w:bottom w:val="single" w:color="D9CFC2" w:sz="4"/>
+              <w:right w:val="single" w:color="D9CFC2" w:sz="4"/>
+            </w:tcBorders>
+            <w:shd w:fill="FAF8F5" w:val="clear"/>
+            <w:tcMar>
+              <w:top w:type="dxa" w:w="60"/>
+              <w:left w:type="dxa" w:w="100"/>
+              <w:bottom w:type="dxa" w:w="60"/>
+              <w:right w:type="dxa" w:w="100"/>
+            </w:tcMar>
+          </w:tcPr>
+          <w:p>
+            <w:pPr>
+              <w:spacing w:after="0"/>
+            </w:pPr>
+          </w:p>
+        </w:tc>
+        <w:tc>
+          <w:tcPr>
+            <w:tcW w:type="dxa" w:w="3524"/>
+            <w:tcBorders>
+              <w:top w:val="single" w:color="D9CFC2" w:sz="4"/>
+              <w:left w:val="single" w:color="D9CFC2" w:sz="4"/>
+              <w:bottom w:val="single" w:color="D9CFC2" w:sz="4"/>
+              <w:right w:val="single" w:color="D9CFC2" w:sz="4"/>
+            </w:tcBorders>
+            <w:shd w:fill="FAF8F5" w:val="clear"/>
             <w:tcMar>
               <w:top w:type="dxa" w:w="60"/>
               <w:left w:type="dxa" w:w="100"/>

</xml_diff>